<commit_message>
docs: stan projektu, README i raport 0.3 po przejściu na Vercel + Neon
- status_projektu.md: sekcja "Na czym stoimy" z planem dalszych kroków,
  log 2026-10-05..07 (Zscaler, LAN, Vercel + Neon, OneDrive), nowe zadania
- README.md: opis zgodny z wersją 0.3 (zamiast szkieletu z fazy 0c)
- nextjs_space/README.md: usunięte nieaktualne admin/admin123
- raport wersji 0.3: okres do 07.10, wdrożenie w chmurze, kopia załączników

Co-Authored-By: Claude Opus 5.5 <noreply@anthropic.com>
</commit_message>
<xml_diff>
--- a/historia_wersji/Historia wersji/CRU2026_Raport_Wersji_0.3.docx
+++ b/historia_wersji/Historia wersji/CRU2026_Raport_Wersji_0.3.docx
@@ -115,7 +115,7 @@
               <w:rPr>
                 <w:sz w:val="20"/>
               </w:rPr>
-              <w:t>01.09.2026  –  05.10.2026</w:t>
+              <w:t>01.09.2026  –  07.10.2026</w:t>
             </w:r>
           </w:p>
         </w:tc>
@@ -144,7 +144,7 @@
               <w:rPr>
                 <w:sz w:val="20"/>
               </w:rPr>
-              <w:t>05.10.2026</w:t>
+              <w:t>07.10.2026</w:t>
             </w:r>
           </w:p>
         </w:tc>
@@ -264,7 +264,7 @@
               <w:rPr>
                 <w:sz w:val="20"/>
               </w:rPr>
-              <w:t>01.09.2026 - 05.10.2026</w:t>
+              <w:t>01.09.2026 - 07.10.2026</w:t>
             </w:r>
           </w:p>
         </w:tc>
@@ -277,7 +277,7 @@
               <w:rPr>
                 <w:sz w:val="20"/>
               </w:rPr>
-              <w:t>05.10.2026</w:t>
+              <w:t>07.10.2026</w:t>
             </w:r>
           </w:p>
         </w:tc>
@@ -290,7 +290,7 @@
               <w:rPr>
                 <w:sz w:val="20"/>
               </w:rPr>
-              <w:t>Pełny stos zapisu dla trzech rejestrów oddany do repozytorium. Komplet 34 specyfikacji funkcji wyprowadzonych ze zrzutu starego systemu - wraz z wykryciem kilkunastu rozbieżności, o których wcześniej nie wiedzieliśmy. Zabezpieczone logowanie i środowisko testowe dostępne dla testerów przez szyfrowany tunel.</w:t>
+              <w:t>Pełny stos zapisu dla trzech rejestrów oddany do repozytorium. Komplet 34 specyfikacji funkcji wyprowadzonych ze zrzutu starego systemu - wraz z wykryciem kilkunastu rozbieżności, o których wcześniej nie wiedzieliśmy. Zabezpieczone logowanie i środowisko testowe dostępne dla testerów pod stałym adresem w chmurze (Vercel, baza Neon w UE) - także z sieci firmowej.</w:t>
             </w:r>
           </w:p>
         </w:tc>
@@ -781,7 +781,7 @@
               <w:rPr>
                 <w:sz w:val="20"/>
               </w:rPr>
-              <w:t>Środowisko testowe na komputerze w biurze: aplikacja, baza i pliki działają lokalnie, a dostęp z internetu zapewnia szyfrowany tunel Cloudflare - bezpłatny, bez otwierania portów i bez uprawnień administratora. Skrypt uruchomieniowy sam stosuje migracje bazy i podnosi usługi po awarii. Opis i plan na przyszłość: docs/deployment.md.</w:t>
+              <w:t>Pierwsza próba środowiska testowego (05.10): aplikacja na komputerze w biurze, dostęp przez darmowy tunel Cloudflare. Działała poza siecią firmową, ale w sieci firmowej logowanie było niemożliwe - patrz wiersze niżej. Zastąpiona 07.10.</w:t>
             </w:r>
           </w:p>
         </w:tc>
@@ -866,6 +866,146 @@
                 <w:sz w:val="20"/>
               </w:rPr>
               <w:t>Luka wykryta w naszych testach: unieważniona sesja nadal mogła czytać dane przy przechodzeniu między ekranami wewnątrz aplikacji. Sprawdzanie sesji przeniesione do warstwy obsługującej każde żądanie; poprawka zweryfikowana.</w:t>
+            </w:r>
+          </w:p>
+        </w:tc>
+      </w:tr>
+      <w:tr>
+        <w:tc>
+          <w:tcPr>
+            <w:tcW w:w="1584" w:type="dxa"/>
+          </w:tcPr>
+          <w:p>
+            <w:r>
+              <w:rPr>
+                <w:sz w:val="20"/>
+              </w:rPr>
+              <w:t>Analiza</w:t>
+            </w:r>
+          </w:p>
+        </w:tc>
+        <w:tc>
+          <w:tcPr>
+            <w:tcW w:w="7200" w:type="dxa"/>
+          </w:tcPr>
+          <w:p>
+            <w:r>
+              <w:rPr>
+                <w:sz w:val="20"/>
+              </w:rPr>
+              <w:t>Przyczyna błędu logowania w sieci firmowej ustalona na żywo: firmowy filtr Zscaler przekierowuje każde żądanie do adresów *.trycloudflare.com przez własny serwer, nawet po zalogowaniu SSO. Strona się otwiera, ale zapytania wykonywane w tle przez formularz logowania przeglądarka odrzuca jako obce. Adresy *.vercel.app i abacus.ai przechodzą bez przekierowań. Dostęp po adresie IP w sieci biurowej też sprawdzony - blokuje go zapora Windows ustawiona centralnie przez IT.</w:t>
+            </w:r>
+          </w:p>
+        </w:tc>
+      </w:tr>
+      <w:tr>
+        <w:tc>
+          <w:tcPr>
+            <w:tcW w:w="1584" w:type="dxa"/>
+          </w:tcPr>
+          <w:p>
+            <w:r>
+              <w:rPr>
+                <w:sz w:val="20"/>
+              </w:rPr>
+              <w:t>Wdrożenie</w:t>
+            </w:r>
+          </w:p>
+        </w:tc>
+        <w:tc>
+          <w:tcPr>
+            <w:tcW w:w="7200" w:type="dxa"/>
+          </w:tcPr>
+          <w:p>
+            <w:r>
+              <w:rPr>
+                <w:sz w:val="20"/>
+              </w:rPr>
+              <w:t>Środowisko testowe przeniesione do chmury: aplikacja na Vercel (https://cru-2026-deployed.vercel.app, serwery we Frankfurcie), baza danych na Neon (PostgreSQL 18, Frankfurt, UE). Przeniesione wszystkie dane, w tym 10 735 umów i konta testowe. Działa z sieci firmowej i z domu; komputer w biurze nie musi być już włączony. Plan bezpłatny - do testów w gronie maksymalnie pięciu osób.</w:t>
+            </w:r>
+          </w:p>
+        </w:tc>
+      </w:tr>
+      <w:tr>
+        <w:tc>
+          <w:tcPr>
+            <w:tcW w:w="1584" w:type="dxa"/>
+          </w:tcPr>
+          <w:p>
+            <w:r>
+              <w:rPr>
+                <w:sz w:val="20"/>
+              </w:rPr>
+              <w:t>Nowa funkcja</w:t>
+            </w:r>
+          </w:p>
+        </w:tc>
+        <w:tc>
+          <w:tcPr>
+            <w:tcW w:w="7200" w:type="dxa"/>
+          </w:tcPr>
+          <w:p>
+            <w:r>
+              <w:rPr>
+                <w:sz w:val="20"/>
+              </w:rPr>
+              <w:t>Tryb pracy bez magazynu plików: w wersji testowej pobieranie i wgrywanie załączników pokazuje czytelny komunikat „nie są jeszcze dostępne” zamiast błędu.</w:t>
+            </w:r>
+          </w:p>
+        </w:tc>
+      </w:tr>
+      <w:tr>
+        <w:tc>
+          <w:tcPr>
+            <w:tcW w:w="1584" w:type="dxa"/>
+          </w:tcPr>
+          <w:p>
+            <w:r>
+              <w:rPr>
+                <w:sz w:val="20"/>
+              </w:rPr>
+              <w:t>Wdrożenie</w:t>
+            </w:r>
+          </w:p>
+        </w:tc>
+        <w:tc>
+          <w:tcPr>
+            <w:tcW w:w="7200" w:type="dxa"/>
+          </w:tcPr>
+          <w:p>
+            <w:r>
+              <w:rPr>
+                <w:sz w:val="20"/>
+              </w:rPr>
+              <w:t>Kopia wszystkich załączników (39 281 plików, 48 GB) w firmowym OneDrive, w tej samej strukturze co w bazie - gotowa do podpięcia do aplikacji przez Microsoft Graph.</w:t>
+            </w:r>
+          </w:p>
+        </w:tc>
+      </w:tr>
+      <w:tr>
+        <w:tc>
+          <w:tcPr>
+            <w:tcW w:w="1584" w:type="dxa"/>
+          </w:tcPr>
+          <w:p>
+            <w:r>
+              <w:rPr>
+                <w:sz w:val="20"/>
+              </w:rPr>
+              <w:t>Bezpieczeństwo</w:t>
+            </w:r>
+          </w:p>
+        </w:tc>
+        <w:tc>
+          <w:tcPr>
+            <w:tcW w:w="7200" w:type="dxa"/>
+          </w:tcPr>
+          <w:p>
+            <w:r>
+              <w:rPr>
+                <w:sz w:val="20"/>
+              </w:rPr>
+              <w:t>Hasło do bazy w chmurze zmienione po konfiguracji, pliki z danymi dostępowymi usunięte z komputera, stary tunel wyłączony wraz z autostartem. Instrukcja obsługi środowiska przepisana od nowa (docs/deployment.md).</w:t>
             </w:r>
           </w:p>
         </w:tc>
@@ -1706,7 +1846,15 @@
         <w:pStyle w:val="Listapunktowana"/>
       </w:pPr>
       <w:r>
-        <w:t>Docelowe środowisko produkcyjne nadal nierozstrzygnięte. Na czas testów aplikacja działa na komputerze w biurze przez darmowy tunel Cloudflare: adres zmienia się po każdym restarcie, a komputer musi pozostać włączony i zalogowany. Wymaga potwierdzenia przez dział IT. Po decyzji firmy: własna domena, stały tunel i dodatkowa bramka e-mail przed logowaniem (Cloudflare Access).</w:t>
+        <w:t>Docelowe środowisko produkcyjne nadal nierozstrzygnięte. Wersja testowa działa od 07.10.2026 na Vercel z bazą Neon (UE), w planie bezpłatnym, który regulamin przewiduje do użytku niekomercyjnego - wystarczy na krótkie testy, przed szerszym użyciem potrzebny plan płatny (ok. 20 USD/mies.) lub hosting firmowy. Dane firmowe u zewnętrznych dostawców wymagają potwierdzenia przez dział IT.</w:t>
+      </w:r>
+    </w:p>
+    <w:p>
+      <w:pPr>
+        <w:pStyle w:val="Listapunktowana"/>
+      </w:pPr>
+      <w:r>
+        <w:t>Załączniki niedostępne w wersji testowej. Pliki są już w OneDrive, ale aplikacja może je czytać dopiero po rejestracji w firmowym Entra ID i zgodzie administratora na dostęp do plików (Microsoft Graph) - wymaga działu IT.</w:t>
       </w:r>
     </w:p>
     <w:p>
@@ -1730,7 +1878,7 @@
         <w:pStyle w:val="Listapunktowana"/>
       </w:pPr>
       <w:r>
-        <w:t>Skrypt uruchomieniowy pomija migracje bazy, więc świeże środowisko nie zapisze ani jednego rekordu. U nas było to niewidoczne, bo sekwencje założono raz ręcznie. Skrypt produkcyjny (run-prod.ps1) stosuje już migracje automatycznie.</w:t>
+        <w:t>Skrypt uruchomieniowy pomija migracje bazy, więc świeże środowisko nie zapisze ani jednego rekordu. U nas było to niewidoczne, bo sekwencje założono raz ręcznie. W środowisku testowym na Vercel migracje uruchamiamy ręcznie przed wdrożeniem - procedura w docs/deployment.md.</w:t>
       </w:r>
     </w:p>
     <w:p>
@@ -1823,7 +1971,15 @@
         <w:pStyle w:val="Listapunktowana"/>
       </w:pPr>
       <w:r>
-        <w:t>Kopie zapasowe wraz z próbnym odtworzeniem, oraz testy automatyczne dla miejsc, w których pomyłka jest kosztowna i niewidoczna. Skrypt kopii zapasowej jest gotowy - czeka na wskazanie drugiego dysku.</w:t>
+        <w:t>Kopie zapasowe wraz z próbnym odtworzeniem, oraz testy automatyczne dla miejsc, w których pomyłka jest kosztowna i niewidoczna. Kopia załączników jest już w OneDrive; baza w Neon ma krótkie okno przywracania, codzienna kopia bazy do OneDrive do zrobienia.</w:t>
+      </w:r>
+    </w:p>
+    <w:p>
+      <w:pPr>
+        <w:pStyle w:val="Listapunktowana"/>
+      </w:pPr>
+      <w:r>
+        <w:t>Podpięcie załączników z OneDrive przez Microsoft Graph (nowy adapter magazynu plików) po zgodzie działu IT, oraz decyzja o docelowym hostingu: płatny plan Vercel z bazą Neon albo serwer firmowy.</w:t>
       </w:r>
     </w:p>
     <w:p>

</xml_diff>